<commit_message>
Polish legal policy modals
</commit_message>
<xml_diff>
--- a/public/legal/cookie-policy-roomie.docx
+++ b/public/legal/cookie-policy-roomie.docx
@@ -4,6 +4,7 @@
   <w:body>
     <w:p>
       <w:pPr>
+        <w:spacing w:after="80"/>
         <w:jc w:val="left"/>
       </w:pPr>
       <w:r>
@@ -11,24 +12,33 @@
           <w:rFonts w:ascii="Arial" w:hAnsi="Arial"/>
           <w:b/>
           <w:color w:val="111111"/>
-          <w:sz w:val="52"/>
+          <w:sz w:val="50"/>
         </w:rPr>
         <w:t>Cookie Policy ROOMIE</w:t>
       </w:r>
     </w:p>
     <w:p>
+      <w:pPr>
+        <w:spacing w:after="200"/>
+      </w:pPr>
       <w:r>
         <w:rPr>
           <w:rFonts w:ascii="Arial" w:hAnsi="Arial"/>
-          <w:color w:val="5A5A5A"/>
+          <w:color w:val="585858"/>
           <w:sz w:val="20"/>
         </w:rPr>
-        <w:t>Informativa sui cookie e tecnologie simili usate dal sito e dall’app Roomie.</w:t>
+        <w:t>Informativa sui cookie e sulle tecnologie simili usate da Roomie per login, sicurezza, pagamenti e preferenze.</w:t>
       </w:r>
     </w:p>
     <w:p>
+      <w:pPr>
+        <w:spacing w:after="280"/>
+      </w:pPr>
       <w:r>
-        <w:t>Ultimo aggiornamento: 23 maggio 2026</w:t>
+        <w:rPr>
+          <w:color w:val="585858"/>
+        </w:rPr>
+        <w:t>Ultimo aggiornamento: 25 maggio 2026</w:t>
       </w:r>
     </w:p>
     <w:p>
@@ -41,7 +51,7 @@
     </w:p>
     <w:p>
       <w:r>
-        <w:t>I cookie sono piccoli file salvati nel browser per mantenere sessioni, preferenze, sicurezza e funzionalità del servizio. Tecnologie simili possono includere local storage, session storage e identificatori tecnici.</w:t>
+        <w:t>I cookie sono piccoli file salvati nel browser per mantenere sessioni, preferenze, sicurezza e funzionalità. Tecnologie simili possono includere local storage, session storage e identificatori tecnici.</w:t>
       </w:r>
     </w:p>
     <w:tbl>
@@ -58,22 +68,28 @@
         <w:tc>
           <w:tcPr>
             <w:tcW w:type="dxa" w:w="4960"/>
-            <w:shd w:fill="EDEDED"/>
+            <w:shd w:fill="EFEFEA"/>
           </w:tcPr>
           <w:p>
             <w:r>
-              <w:t>Voce</w:t>
+              <w:rPr>
+                <w:b/>
+              </w:rPr>
+              <w:t>Area</w:t>
             </w:r>
           </w:p>
         </w:tc>
         <w:tc>
           <w:tcPr>
             <w:tcW w:type="dxa" w:w="4960"/>
-            <w:shd w:fill="EDEDED"/>
+            <w:shd w:fill="EFEFEA"/>
           </w:tcPr>
           <w:p>
             <w:r>
-              <w:t>Dettaglio</w:t>
+              <w:rPr>
+                <w:b/>
+              </w:rPr>
+              <w:t>Uso</w:t>
             </w:r>
           </w:p>
         </w:tc>
@@ -85,7 +101,7 @@
           </w:tcPr>
           <w:p>
             <w:r>
-              <w:t>Cookie essenziali</w:t>
+              <w:t>Essenziali</w:t>
             </w:r>
           </w:p>
         </w:tc>
@@ -95,7 +111,7 @@
           </w:tcPr>
           <w:p>
             <w:r>
-              <w:t>Necessari per login, sessione, sicurezza, preferenze minime e funzionamento del checkout.</w:t>
+              <w:t>Login, sicurezza, sessione, navigazione, preferenze minime e funzionamento del checkout.</w:t>
             </w:r>
           </w:p>
         </w:tc>
@@ -107,7 +123,7 @@
           </w:tcPr>
           <w:p>
             <w:r>
-              <w:t>Cookie funzionali</w:t>
+              <w:t>Funzionali</w:t>
             </w:r>
           </w:p>
         </w:tc>
@@ -117,7 +133,7 @@
           </w:tcPr>
           <w:p>
             <w:r>
-              <w:t>Usati per ricordare stato UI, pagina corrente e impostazioni utili all’esperienza.</w:t>
+              <w:t>Memorizzazione di stato interfaccia, pagina corrente e impostazioni utili all’esperienza.</w:t>
             </w:r>
           </w:p>
         </w:tc>
@@ -129,7 +145,7 @@
           </w:tcPr>
           <w:p>
             <w:r>
-              <w:t>Cookie analytics</w:t>
+              <w:t>Analytics</w:t>
             </w:r>
           </w:p>
         </w:tc>
@@ -139,7 +155,7 @@
           </w:tcPr>
           <w:p>
             <w:r>
-              <w:t>Da attivare solo se configurati con strumenti privacy-compliant e preferibilmente anonimizzati.</w:t>
+              <w:t>Misurazione tecnica e miglioramento del servizio quando configurati in modo privacy-compliant.</w:t>
             </w:r>
           </w:p>
         </w:tc>
@@ -151,7 +167,7 @@
           </w:tcPr>
           <w:p>
             <w:r>
-              <w:t>Cookie marketing</w:t>
+              <w:t>Marketing</w:t>
             </w:r>
           </w:p>
         </w:tc>
@@ -161,7 +177,7 @@
           </w:tcPr>
           <w:p>
             <w:r>
-              <w:t>Non attivi di default. Richiedono consenso specifico se introdotti.</w:t>
+              <w:t>Non necessari al funzionamento. Richiedono consenso specifico quando introdotti.</w:t>
             </w:r>
           </w:p>
         </w:tc>
@@ -173,7 +189,7 @@
         <w:pStyle w:val="Heading1"/>
       </w:pPr>
       <w:r>
-        <w:t>2. Cookie essenziali Roomie</w:t>
+        <w:t>2. Cookie essenziali</w:t>
       </w:r>
     </w:p>
     <w:p>
@@ -189,7 +205,7 @@
         <w:pStyle w:val="ListBullet"/>
       </w:pPr>
       <w:r>
-        <w:t>Cookie tecnici di Vercel/hosting: servono a erogare il sito e mantenere sicurezza e performance.</w:t>
+        <w:t>Cookie tecnici Vercel: erogazione del sito, sicurezza e performance.</w:t>
       </w:r>
     </w:p>
     <w:p>
@@ -197,7 +213,7 @@
         <w:pStyle w:val="ListBullet"/>
       </w:pPr>
       <w:r>
-        <w:t>Cookie Stripe: usati solo quando apri Stripe Checkout per completare una ricarica chips.</w:t>
+        <w:t>Cookie Stripe: usati quando apri Stripe Checkout per completare una ricarica chips.</w:t>
       </w:r>
     </w:p>
     <w:p>
@@ -205,7 +221,7 @@
         <w:pStyle w:val="ListBullet"/>
       </w:pPr>
       <w:r>
-        <w:t>Cookie Google: usati solo se scegli il login con Google.</w:t>
+        <w:t>Cookie Google: usati se scegli il login con Google.</w:t>
       </w:r>
     </w:p>
     <w:p>
@@ -218,7 +234,7 @@
     </w:p>
     <w:p>
       <w:r>
-        <w:t>I cookie di sessione possono durare fino a 12 ore o fino a 30 giorni se scegli “ricordami”. Cookie di terze parti seguono le durate definite dai rispettivi fornitori.</w:t>
+        <w:t>I cookie di sessione possono durare fino a 12 ore o fino a 30 giorni se scegli una modalità di accesso persistente. I cookie di terze parti seguono le durate definite dai rispettivi fornitori.</w:t>
       </w:r>
     </w:p>
     <w:p>
@@ -226,12 +242,12 @@
         <w:pStyle w:val="Heading1"/>
       </w:pPr>
       <w:r>
-        <w:t>4. Gestione preferenze</w:t>
+        <w:t>4. Gestione delle preferenze</w:t>
       </w:r>
     </w:p>
     <w:p>
       <w:r>
-        <w:t>Puoi cancellare o bloccare i cookie dal browser. Bloccare i cookie essenziali può impedire login, checkout, prenotazioni e accesso alle aree personali.</w:t>
+        <w:t>Puoi cancellare o bloccare i cookie dal browser. Il blocco dei cookie essenziali può impedire login, checkout, prenotazioni e accesso alle aree personali.</w:t>
       </w:r>
     </w:p>
     <w:p>
@@ -255,7 +271,7 @@
         <w:pStyle w:val="ListBullet"/>
       </w:pPr>
       <w:r>
-        <w:t>Stripe: pagamenti e checkout sicuro.</w:t>
+        <w:t>Stripe: checkout e pagamenti sicuri.</w:t>
       </w:r>
     </w:p>
     <w:p>
@@ -263,7 +279,7 @@
         <w:pStyle w:val="ListBullet"/>
       </w:pPr>
       <w:r>
-        <w:t>Vercel: hosting e delivery del servizio.</w:t>
+        <w:t>Vercel: hosting, delivery e sicurezza applicativa.</w:t>
       </w:r>
     </w:p>
     <w:p>
@@ -276,25 +292,12 @@
     </w:p>
     <w:p>
       <w:r>
-        <w:t>La Cookie Policy può cambiare quando Roomie introduce nuove funzionalità, analytics, strumenti marketing, nuovi fornitori o modifiche tecniche rilevanti.</w:t>
-      </w:r>
-    </w:p>
-    <w:p>
-      <w:pPr>
-        <w:pStyle w:val="Heading1"/>
-      </w:pPr>
-      <w:r>
-        <w:t>7. Nota</w:t>
-      </w:r>
-    </w:p>
-    <w:p>
-      <w:r>
-        <w:t>Questa policy è una base operativa. Prima del lancio pubblico completo va completata con banner consenso, registro cookie effettivo e verifica legale.</w:t>
+        <w:t>Roomie può aggiornare questa Cookie Policy quando introduce nuove funzionalità, strumenti tecnici, analytics, fornitori o modalità di consenso.</w:t>
       </w:r>
     </w:p>
     <w:sectPr>
       <w:pgSz w:w="12240" w:h="15840"/>
-      <w:pgMar w:top="1120" w:right="1160" w:bottom="1120" w:left="1160" w:header="720" w:footer="720" w:gutter="0"/>
+      <w:pgMar w:top="1080" w:right="1160" w:bottom="1080" w:left="1160" w:header="720" w:footer="720" w:gutter="0"/>
       <w:cols w:space="720"/>
       <w:docGrid w:linePitch="360"/>
     </w:sectPr>
@@ -665,6 +668,9 @@
     <w:name w:val="Normal"/>
     <w:qFormat/>
     <w:rsid w:val="00FC693F"/>
+    <w:pPr>
+      <w:spacing w:after="160" w:line="276" w:lineRule="auto"/>
+    </w:pPr>
     <w:rPr>
       <w:rFonts w:ascii="Arial" w:hAnsi="Arial" w:eastAsia="Arial"/>
       <w:sz w:val="21"/>
@@ -725,7 +731,7 @@
     <w:pPr>
       <w:keepNext/>
       <w:keepLines/>
-      <w:spacing w:before="480" w:after="0"/>
+      <w:spacing w:before="320" w:after="120"/>
       <w:outlineLvl w:val="0"/>
     </w:pPr>
     <w:rPr>
@@ -733,7 +739,7 @@
       <w:b/>
       <w:bCs/>
       <w:color w:val="111111"/>
-      <w:sz w:val="36"/>
+      <w:sz w:val="34"/>
       <w:szCs w:val="28"/>
     </w:rPr>
   </w:style>
@@ -749,7 +755,7 @@
     <w:pPr>
       <w:keepNext/>
       <w:keepLines/>
-      <w:spacing w:before="200" w:after="0"/>
+      <w:spacing w:before="320" w:after="120"/>
       <w:outlineLvl w:val="1"/>
     </w:pPr>
     <w:rPr>
@@ -757,7 +763,7 @@
       <w:b/>
       <w:bCs/>
       <w:color w:val="111111"/>
-      <w:sz w:val="26"/>
+      <w:sz w:val="25"/>
       <w:szCs w:val="26"/>
     </w:rPr>
   </w:style>

</xml_diff>